<commit_message>
legal rev strategy update
</commit_message>
<xml_diff>
--- a/SageReasoning_Legal_Revenue_Business_Plan.docx
+++ b/SageReasoning_Legal_Revenue_Business_Plan.docx
@@ -1004,7 +1004,7 @@
                 <w:sz w:val="20"/>
                 <w:szCs w:val="20"/>
               </w:rPr>
-              <w:t xml:space="preserve">Strong alignment — human wellbeing primary goal, Stoic Brain data is open-source, scoring explained</w:t>
+              <w:t xml:space="preserve">Strong alignment — human wellbeing primary goal, Stoic Brain framework overview is publicly accessible, scoring explained. Data now under SageReasoning Proprietary Licence (evaluation use permitted, competing services prohibited)</w:t>
             </w:r>
           </w:p>
         </w:tc>
@@ -3235,7 +3235,7 @@
                 <w:sz w:val="20"/>
                 <w:szCs w:val="20"/>
               </w:rPr>
-              <w:t xml:space="preserve">5 actions/day, baseline assessment, scenarios, social filter (5/day), journal (all 56 days), API (1,000 calls/month)</w:t>
+              <w:t xml:space="preserve">5 actions/day (human), baseline assessment, scenarios, social filter (5/day), journal (all 56 days). AI Agent free tier: 1 API call/day (30/month), 1 deliberation iteration, 1 baseline retake/month per agent identity</w:t>
             </w:r>
           </w:p>
         </w:tc>
@@ -3541,7 +3541,7 @@
                 <w:sz w:val="20"/>
                 <w:szCs w:val="20"/>
               </w:rPr>
-              <w:t xml:space="preserve">Developers integrating Stoic reasoning pay for AI processing only. The data itself remains MIT-licensed and free.</w:t>
+              <w:t xml:space="preserve">Developers integrating Stoic reasoning pay per API call at 150% of Anthropic API cost (approximately 50% gross margin). Public JSON files provide a conceptual overview for discovery; full scoring weights and formulas are proprietary and applied server-side. The data is licensed under the SageReasoning Proprietary Licence — evaluation use is free, production use requires a paid API key, and use to build competing services is prohibited.</w:t>
             </w:r>
           </w:p>
         </w:tc>
@@ -10704,7 +10704,7 @@
                 <w:sz w:val="20"/>
                 <w:szCs w:val="20"/>
               </w:rPr>
-              <w:t xml:space="preserve">Not yet mitigated — no rate limits on free tier Prokoptos features</w:t>
+              <w:t xml:space="preserve">Partially mitigated — AI Agent API tier now enforces strict rate limits (1 call/day free, paid keys configurable). Deliberation chains capped at 1 iteration (free) / 3 iterations (paid). Baseline retakes limited to 1/month per agent identity. Proprietary licence prohibits use of public data to build competing services</w:t>
             </w:r>
           </w:p>
         </w:tc>
@@ -10731,7 +10731,7 @@
                 <w:sz w:val="20"/>
                 <w:szCs w:val="20"/>
               </w:rPr>
-              <w:t xml:space="preserve">Implement rate limits in Phase 2 when Stripe is live</w:t>
+              <w:t xml:space="preserve">DONE — AI Agent rate limits deployed (29 March 2026). Remaining: Stripe integration for paid tier provisioning and human Prokoptos feature rate limits</w:t>
             </w:r>
           </w:p>
         </w:tc>
@@ -13221,7 +13221,7 @@
                 <w:sz w:val="20"/>
                 <w:szCs w:val="20"/>
               </w:rPr>
-              <w:t xml:space="preserve">Free (open-source)</w:t>
+              <w:t xml:space="preserve">SageReasoning Proprietary Licence v1.0 (evaluation free, production API paid, competing services prohibited)</w:t>
             </w:r>
           </w:p>
         </w:tc>

</xml_diff>